<commit_message>
feat: sprint features — soft delete offices, remove login dropdown, auth suspension block, worker profile, Aadhaar masking
- feat: Office soft delete (suspend/activate toggle instead of hard delete)
- feat: Remove company dropdown from login — email + password only
- feat: Block login for suspended users and suspended tenants (403 + clear message)
- feat: Enhanced worker profile detail drawer with role badge, status, office, member-since
- feat: Backend GET /employees/:id route for single worker detail
- feat: Aadhaar/ID masking in all visitor GET responses (XXXX-XXXX-1234 format)
- feat: id_number made optional, added id_type, email, company_name, address to Visitor model
- feat: PATCH /offices/:id/toggle-status backend route + frontend mutation hook
</commit_message>
<xml_diff>
--- a/Atithi_VMS_Final_Project_Report.docx
+++ b/Atithi_VMS_Final_Project_Report.docx
@@ -110,12 +110,6 @@
         <w:gridCol w:w="4500"/>
       </w:tblGrid>
       <w:tr>
-        <w:tblPrEx>
-          <w:tblCellMar>
-            <w:top w:w="0" w:type="dxa"/>
-            <w:bottom w:w="0" w:type="dxa"/>
-          </w:tblCellMar>
-        </w:tblPrEx>
         <w:trPr>
           <w:jc w:val="center"/>
         </w:trPr>
@@ -152,12 +146,6 @@
         </w:tc>
       </w:tr>
       <w:tr>
-        <w:tblPrEx>
-          <w:tblCellMar>
-            <w:top w:w="0" w:type="dxa"/>
-            <w:bottom w:w="0" w:type="dxa"/>
-          </w:tblCellMar>
-        </w:tblPrEx>
         <w:trPr>
           <w:jc w:val="center"/>
         </w:trPr>
@@ -194,12 +182,6 @@
         </w:tc>
       </w:tr>
       <w:tr>
-        <w:tblPrEx>
-          <w:tblCellMar>
-            <w:top w:w="0" w:type="dxa"/>
-            <w:bottom w:w="0" w:type="dxa"/>
-          </w:tblCellMar>
-        </w:tblPrEx>
         <w:trPr>
           <w:jc w:val="center"/>
         </w:trPr>
@@ -208,7 +190,7 @@
             <w:tcW w:w="2500" w:type="dxa"/>
           </w:tcPr>
           <w:p>
-            <w:pPr>
+            <w:r>
               <w:rPr>
                 <w:b/>
                 <w:bCs/>
@@ -216,146 +198,83 @@
                 <w:sz w:val="21"/>
                 <w:szCs w:val="21"/>
               </w:rPr>
-            </w:pPr>
-            <w:r>
-              <w:rPr>
-                <w:b/>
-                <w:bCs/>
-                <w:color w:val="595959"/>
+              <w:t>Contributors:</w:t>
+            </w:r>
+          </w:p>
+        </w:tc>
+        <w:tc>
+          <w:tcPr>
+            <w:tcW w:w="4500" w:type="dxa"/>
+          </w:tcPr>
+          <w:p>
+            <w:proofErr w:type="spellStart"/>
+            <w:r>
+              <w:rPr>
                 <w:sz w:val="21"/>
                 <w:szCs w:val="21"/>
               </w:rPr>
-              <w:t>Project Link</w:t>
-            </w:r>
-          </w:p>
-        </w:tc>
-        <w:tc>
-          <w:tcPr>
-            <w:tcW w:w="4500" w:type="dxa"/>
-          </w:tcPr>
-          <w:p>
-            <w:pPr>
+              <w:t>Abhiral</w:t>
+            </w:r>
+            <w:proofErr w:type="spellEnd"/>
+            <w:r>
               <w:rPr>
                 <w:sz w:val="21"/>
                 <w:szCs w:val="21"/>
               </w:rPr>
-            </w:pPr>
+              <w:t xml:space="preserve"> Jain (</w:t>
+            </w:r>
             <w:r>
               <w:rPr>
                 <w:sz w:val="21"/>
                 <w:szCs w:val="21"/>
               </w:rPr>
-              <w:t>https://visitor-management-system-bxwbc0wsd-abhiraljain07s-projects.vercel.app/login</w:t>
+              <w:t xml:space="preserve">Backend </w:t>
+            </w:r>
+            <w:r>
+              <w:rPr>
+                <w:sz w:val="21"/>
+                <w:szCs w:val="21"/>
+              </w:rPr>
+              <w:t>Developer &amp; Architect)</w:t>
+            </w:r>
+          </w:p>
+          <w:p>
+            <w:proofErr w:type="spellStart"/>
+            <w:r>
+              <w:rPr>
+                <w:sz w:val="21"/>
+                <w:szCs w:val="21"/>
+              </w:rPr>
+              <w:t>Anunay</w:t>
+            </w:r>
+            <w:proofErr w:type="spellEnd"/>
+            <w:r>
+              <w:rPr>
+                <w:sz w:val="21"/>
+                <w:szCs w:val="21"/>
+              </w:rPr>
+              <w:t xml:space="preserve"> </w:t>
+            </w:r>
+            <w:proofErr w:type="spellStart"/>
+            <w:r>
+              <w:rPr>
+                <w:sz w:val="21"/>
+                <w:szCs w:val="21"/>
+              </w:rPr>
+              <w:t>Chhapre</w:t>
+            </w:r>
+            <w:proofErr w:type="spellEnd"/>
+            <w:r>
+              <w:rPr>
+                <w:sz w:val="21"/>
+                <w:szCs w:val="21"/>
+              </w:rPr>
+              <w:t xml:space="preserve"> (Frontend Developer &amp; UI)</w:t>
             </w:r>
           </w:p>
         </w:tc>
       </w:tr>
       <w:tr>
-        <w:tblPrEx>
-          <w:tblCellMar>
-            <w:top w:w="0" w:type="dxa"/>
-            <w:bottom w:w="0" w:type="dxa"/>
-          </w:tblCellMar>
-        </w:tblPrEx>
-        <w:trPr>
-          <w:jc w:val="center"/>
-        </w:trPr>
-        <w:tc>
-          <w:tcPr>
-            <w:tcW w:w="2500" w:type="dxa"/>
-          </w:tcPr>
-          <w:p>
-            <w:r>
-              <w:rPr>
-                <w:b/>
-                <w:bCs/>
-                <w:color w:val="595959"/>
-                <w:sz w:val="21"/>
-                <w:szCs w:val="21"/>
-              </w:rPr>
-              <w:t>Contributors:</w:t>
-            </w:r>
-          </w:p>
-        </w:tc>
-        <w:tc>
-          <w:tcPr>
-            <w:tcW w:w="4500" w:type="dxa"/>
-          </w:tcPr>
-          <w:p>
-            <w:proofErr w:type="spellStart"/>
-            <w:r>
-              <w:rPr>
-                <w:sz w:val="21"/>
-                <w:szCs w:val="21"/>
-              </w:rPr>
-              <w:t>Abhiral</w:t>
-            </w:r>
-            <w:proofErr w:type="spellEnd"/>
-            <w:r>
-              <w:rPr>
-                <w:sz w:val="21"/>
-                <w:szCs w:val="21"/>
-              </w:rPr>
-              <w:t xml:space="preserve"> Jain (</w:t>
-            </w:r>
-            <w:r>
-              <w:rPr>
-                <w:sz w:val="21"/>
-                <w:szCs w:val="21"/>
-              </w:rPr>
-              <w:t xml:space="preserve">Backend </w:t>
-            </w:r>
-            <w:r>
-              <w:rPr>
-                <w:sz w:val="21"/>
-                <w:szCs w:val="21"/>
-              </w:rPr>
-              <w:t>Developer &amp; Architect)</w:t>
-            </w:r>
-          </w:p>
-          <w:p>
-            <w:proofErr w:type="spellStart"/>
-            <w:r>
-              <w:rPr>
-                <w:sz w:val="21"/>
-                <w:szCs w:val="21"/>
-              </w:rPr>
-              <w:t>Anunay</w:t>
-            </w:r>
-            <w:proofErr w:type="spellEnd"/>
-            <w:r>
-              <w:rPr>
-                <w:sz w:val="21"/>
-                <w:szCs w:val="21"/>
-              </w:rPr>
-              <w:t xml:space="preserve"> </w:t>
-            </w:r>
-            <w:proofErr w:type="spellStart"/>
-            <w:r>
-              <w:rPr>
-                <w:sz w:val="21"/>
-                <w:szCs w:val="21"/>
-              </w:rPr>
-              <w:t>Chhapre</w:t>
-            </w:r>
-            <w:proofErr w:type="spellEnd"/>
-            <w:r>
-              <w:rPr>
-                <w:sz w:val="21"/>
-                <w:szCs w:val="21"/>
-              </w:rPr>
-              <w:t xml:space="preserve"> (Frontend Developer &amp; UI)</w:t>
-            </w:r>
-          </w:p>
-        </w:tc>
-      </w:tr>
-      <w:tr>
-        <w:tblPrEx>
-          <w:tblCellMar>
-            <w:top w:w="0" w:type="dxa"/>
-            <w:bottom w:w="0" w:type="dxa"/>
-          </w:tblCellMar>
-        </w:tblPrEx>
         <w:trPr>
           <w:jc w:val="center"/>
         </w:trPr>
@@ -927,21 +846,7 @@
                 <w:rStyle w:val="Hyperlink"/>
                 <w:noProof/>
               </w:rPr>
-              <w:t>3. Implemen</w:t>
-            </w:r>
-            <w:r>
-              <w:rPr>
-                <w:rStyle w:val="Hyperlink"/>
-                <w:noProof/>
-              </w:rPr>
-              <w:t>t</w:t>
-            </w:r>
-            <w:r>
-              <w:rPr>
-                <w:rStyle w:val="Hyperlink"/>
-                <w:noProof/>
-              </w:rPr>
-              <w:t>ed Solution: Atithi VMS</w:t>
+              <w:t>3. Implemented Solution: Atithi VMS</w:t>
             </w:r>
             <w:r>
               <w:rPr>
@@ -1904,12 +1809,6 @@
         <w:gridCol w:w="4680"/>
       </w:tblGrid>
       <w:tr>
-        <w:tblPrEx>
-          <w:tblCellMar>
-            <w:top w:w="0" w:type="dxa"/>
-            <w:bottom w:w="0" w:type="dxa"/>
-          </w:tblCellMar>
-        </w:tblPrEx>
         <w:tc>
           <w:tcPr>
             <w:tcW w:w="4680" w:type="dxa"/>
@@ -1972,12 +1871,6 @@
         </w:tc>
       </w:tr>
       <w:tr>
-        <w:tblPrEx>
-          <w:tblCellMar>
-            <w:top w:w="0" w:type="dxa"/>
-            <w:bottom w:w="0" w:type="dxa"/>
-          </w:tblCellMar>
-        </w:tblPrEx>
         <w:tc>
           <w:tcPr>
             <w:tcW w:w="4680" w:type="dxa"/>
@@ -2040,12 +1933,6 @@
         </w:tc>
       </w:tr>
       <w:tr>
-        <w:tblPrEx>
-          <w:tblCellMar>
-            <w:top w:w="0" w:type="dxa"/>
-            <w:bottom w:w="0" w:type="dxa"/>
-          </w:tblCellMar>
-        </w:tblPrEx>
         <w:tc>
           <w:tcPr>
             <w:tcW w:w="4680" w:type="dxa"/>
@@ -2589,12 +2476,6 @@
         <w:gridCol w:w="6960"/>
       </w:tblGrid>
       <w:tr>
-        <w:tblPrEx>
-          <w:tblCellMar>
-            <w:top w:w="0" w:type="dxa"/>
-            <w:bottom w:w="0" w:type="dxa"/>
-          </w:tblCellMar>
-        </w:tblPrEx>
         <w:tc>
           <w:tcPr>
             <w:tcW w:w="2400" w:type="dxa"/>
@@ -2659,12 +2540,6 @@
         </w:tc>
       </w:tr>
       <w:tr>
-        <w:tblPrEx>
-          <w:tblCellMar>
-            <w:top w:w="0" w:type="dxa"/>
-            <w:bottom w:w="0" w:type="dxa"/>
-          </w:tblCellMar>
-        </w:tblPrEx>
         <w:tc>
           <w:tcPr>
             <w:tcW w:w="2400" w:type="dxa"/>
@@ -2829,12 +2704,6 @@
         </w:tc>
       </w:tr>
       <w:tr>
-        <w:tblPrEx>
-          <w:tblCellMar>
-            <w:top w:w="0" w:type="dxa"/>
-            <w:bottom w:w="0" w:type="dxa"/>
-          </w:tblCellMar>
-        </w:tblPrEx>
         <w:tc>
           <w:tcPr>
             <w:tcW w:w="2400" w:type="dxa"/>
@@ -2942,12 +2811,6 @@
         </w:tc>
       </w:tr>
       <w:tr>
-        <w:tblPrEx>
-          <w:tblCellMar>
-            <w:top w:w="0" w:type="dxa"/>
-            <w:bottom w:w="0" w:type="dxa"/>
-          </w:tblCellMar>
-        </w:tblPrEx>
         <w:tc>
           <w:tcPr>
             <w:tcW w:w="2400" w:type="dxa"/>
@@ -3039,12 +2902,6 @@
         </w:tc>
       </w:tr>
       <w:tr>
-        <w:tblPrEx>
-          <w:tblCellMar>
-            <w:top w:w="0" w:type="dxa"/>
-            <w:bottom w:w="0" w:type="dxa"/>
-          </w:tblCellMar>
-        </w:tblPrEx>
         <w:tc>
           <w:tcPr>
             <w:tcW w:w="2400" w:type="dxa"/>
@@ -3104,12 +2961,6 @@
         </w:tc>
       </w:tr>
       <w:tr>
-        <w:tblPrEx>
-          <w:tblCellMar>
-            <w:top w:w="0" w:type="dxa"/>
-            <w:bottom w:w="0" w:type="dxa"/>
-          </w:tblCellMar>
-        </w:tblPrEx>
         <w:tc>
           <w:tcPr>
             <w:tcW w:w="2400" w:type="dxa"/>
@@ -3232,12 +3083,6 @@
         <w:gridCol w:w="7160"/>
       </w:tblGrid>
       <w:tr>
-        <w:tblPrEx>
-          <w:tblCellMar>
-            <w:top w:w="0" w:type="dxa"/>
-            <w:bottom w:w="0" w:type="dxa"/>
-          </w:tblCellMar>
-        </w:tblPrEx>
         <w:tc>
           <w:tcPr>
             <w:tcW w:w="2200" w:type="dxa"/>
@@ -3302,12 +3147,6 @@
         </w:tc>
       </w:tr>
       <w:tr>
-        <w:tblPrEx>
-          <w:tblCellMar>
-            <w:top w:w="0" w:type="dxa"/>
-            <w:bottom w:w="0" w:type="dxa"/>
-          </w:tblCellMar>
-        </w:tblPrEx>
         <w:tc>
           <w:tcPr>
             <w:tcW w:w="2200" w:type="dxa"/>
@@ -3367,12 +3206,6 @@
         </w:tc>
       </w:tr>
       <w:tr>
-        <w:tblPrEx>
-          <w:tblCellMar>
-            <w:top w:w="0" w:type="dxa"/>
-            <w:bottom w:w="0" w:type="dxa"/>
-          </w:tblCellMar>
-        </w:tblPrEx>
         <w:tc>
           <w:tcPr>
             <w:tcW w:w="2200" w:type="dxa"/>
@@ -3432,12 +3265,6 @@
         </w:tc>
       </w:tr>
       <w:tr>
-        <w:tblPrEx>
-          <w:tblCellMar>
-            <w:top w:w="0" w:type="dxa"/>
-            <w:bottom w:w="0" w:type="dxa"/>
-          </w:tblCellMar>
-        </w:tblPrEx>
         <w:tc>
           <w:tcPr>
             <w:tcW w:w="2200" w:type="dxa"/>
@@ -3497,12 +3324,6 @@
         </w:tc>
       </w:tr>
       <w:tr>
-        <w:tblPrEx>
-          <w:tblCellMar>
-            <w:top w:w="0" w:type="dxa"/>
-            <w:bottom w:w="0" w:type="dxa"/>
-          </w:tblCellMar>
-        </w:tblPrEx>
         <w:tc>
           <w:tcPr>
             <w:tcW w:w="2200" w:type="dxa"/>
@@ -3562,12 +3383,6 @@
         </w:tc>
       </w:tr>
       <w:tr>
-        <w:tblPrEx>
-          <w:tblCellMar>
-            <w:top w:w="0" w:type="dxa"/>
-            <w:bottom w:w="0" w:type="dxa"/>
-          </w:tblCellMar>
-        </w:tblPrEx>
         <w:tc>
           <w:tcPr>
             <w:tcW w:w="2200" w:type="dxa"/>
@@ -3627,12 +3442,6 @@
         </w:tc>
       </w:tr>
       <w:tr>
-        <w:tblPrEx>
-          <w:tblCellMar>
-            <w:top w:w="0" w:type="dxa"/>
-            <w:bottom w:w="0" w:type="dxa"/>
-          </w:tblCellMar>
-        </w:tblPrEx>
         <w:tc>
           <w:tcPr>
             <w:tcW w:w="2200" w:type="dxa"/>
@@ -4047,12 +3856,6 @@
         <w:gridCol w:w="2400"/>
       </w:tblGrid>
       <w:tr>
-        <w:tblPrEx>
-          <w:tblCellMar>
-            <w:top w:w="0" w:type="dxa"/>
-            <w:bottom w:w="0" w:type="dxa"/>
-          </w:tblCellMar>
-        </w:tblPrEx>
         <w:tc>
           <w:tcPr>
             <w:tcW w:w="3360" w:type="dxa"/>
@@ -4151,12 +3954,6 @@
         </w:tc>
       </w:tr>
       <w:tr>
-        <w:tblPrEx>
-          <w:tblCellMar>
-            <w:top w:w="0" w:type="dxa"/>
-            <w:bottom w:w="0" w:type="dxa"/>
-          </w:tblCellMar>
-        </w:tblPrEx>
         <w:tc>
           <w:tcPr>
             <w:tcW w:w="3360" w:type="dxa"/>
@@ -4247,12 +4044,6 @@
         </w:tc>
       </w:tr>
       <w:tr>
-        <w:tblPrEx>
-          <w:tblCellMar>
-            <w:top w:w="0" w:type="dxa"/>
-            <w:bottom w:w="0" w:type="dxa"/>
-          </w:tblCellMar>
-        </w:tblPrEx>
         <w:tc>
           <w:tcPr>
             <w:tcW w:w="3360" w:type="dxa"/>
@@ -4352,12 +4143,6 @@
         </w:tc>
       </w:tr>
       <w:tr>
-        <w:tblPrEx>
-          <w:tblCellMar>
-            <w:top w:w="0" w:type="dxa"/>
-            <w:bottom w:w="0" w:type="dxa"/>
-          </w:tblCellMar>
-        </w:tblPrEx>
         <w:tc>
           <w:tcPr>
             <w:tcW w:w="3360" w:type="dxa"/>
@@ -4448,12 +4233,6 @@
         </w:tc>
       </w:tr>
       <w:tr>
-        <w:tblPrEx>
-          <w:tblCellMar>
-            <w:top w:w="0" w:type="dxa"/>
-            <w:bottom w:w="0" w:type="dxa"/>
-          </w:tblCellMar>
-        </w:tblPrEx>
         <w:tc>
           <w:tcPr>
             <w:tcW w:w="3360" w:type="dxa"/>
@@ -4544,12 +4323,6 @@
         </w:tc>
       </w:tr>
       <w:tr>
-        <w:tblPrEx>
-          <w:tblCellMar>
-            <w:top w:w="0" w:type="dxa"/>
-            <w:bottom w:w="0" w:type="dxa"/>
-          </w:tblCellMar>
-        </w:tblPrEx>
         <w:tc>
           <w:tcPr>
             <w:tcW w:w="3360" w:type="dxa"/>
@@ -4672,12 +4445,6 @@
         </w:tc>
       </w:tr>
       <w:tr>
-        <w:tblPrEx>
-          <w:tblCellMar>
-            <w:top w:w="0" w:type="dxa"/>
-            <w:bottom w:w="0" w:type="dxa"/>
-          </w:tblCellMar>
-        </w:tblPrEx>
         <w:tc>
           <w:tcPr>
             <w:tcW w:w="3360" w:type="dxa"/>
@@ -4880,12 +4647,6 @@
         </w:tc>
       </w:tr>
       <w:tr>
-        <w:tblPrEx>
-          <w:tblCellMar>
-            <w:top w:w="0" w:type="dxa"/>
-            <w:bottom w:w="0" w:type="dxa"/>
-          </w:tblCellMar>
-        </w:tblPrEx>
         <w:tc>
           <w:tcPr>
             <w:tcW w:w="3360" w:type="dxa"/>
@@ -4976,12 +4737,6 @@
         </w:tc>
       </w:tr>
       <w:tr>
-        <w:tblPrEx>
-          <w:tblCellMar>
-            <w:top w:w="0" w:type="dxa"/>
-            <w:bottom w:w="0" w:type="dxa"/>
-          </w:tblCellMar>
-        </w:tblPrEx>
         <w:tc>
           <w:tcPr>
             <w:tcW w:w="3360" w:type="dxa"/>
@@ -5073,12 +4828,6 @@
         </w:tc>
       </w:tr>
       <w:tr>
-        <w:tblPrEx>
-          <w:tblCellMar>
-            <w:top w:w="0" w:type="dxa"/>
-            <w:bottom w:w="0" w:type="dxa"/>
-          </w:tblCellMar>
-        </w:tblPrEx>
         <w:tc>
           <w:tcPr>
             <w:tcW w:w="3360" w:type="dxa"/>
@@ -5169,12 +4918,6 @@
         </w:tc>
       </w:tr>
       <w:tr>
-        <w:tblPrEx>
-          <w:tblCellMar>
-            <w:top w:w="0" w:type="dxa"/>
-            <w:bottom w:w="0" w:type="dxa"/>
-          </w:tblCellMar>
-        </w:tblPrEx>
         <w:tc>
           <w:tcPr>
             <w:tcW w:w="3360" w:type="dxa"/>
@@ -5281,12 +5024,6 @@
         </w:tc>
       </w:tr>
       <w:tr>
-        <w:tblPrEx>
-          <w:tblCellMar>
-            <w:top w:w="0" w:type="dxa"/>
-            <w:bottom w:w="0" w:type="dxa"/>
-          </w:tblCellMar>
-        </w:tblPrEx>
         <w:tc>
           <w:tcPr>
             <w:tcW w:w="3360" w:type="dxa"/>
@@ -5377,12 +5114,6 @@
         </w:tc>
       </w:tr>
       <w:tr>
-        <w:tblPrEx>
-          <w:tblCellMar>
-            <w:top w:w="0" w:type="dxa"/>
-            <w:bottom w:w="0" w:type="dxa"/>
-          </w:tblCellMar>
-        </w:tblPrEx>
         <w:tc>
           <w:tcPr>
             <w:tcW w:w="3360" w:type="dxa"/>
@@ -5473,12 +5204,6 @@
         </w:tc>
       </w:tr>
       <w:tr>
-        <w:tblPrEx>
-          <w:tblCellMar>
-            <w:top w:w="0" w:type="dxa"/>
-            <w:bottom w:w="0" w:type="dxa"/>
-          </w:tblCellMar>
-        </w:tblPrEx>
         <w:tc>
           <w:tcPr>
             <w:tcW w:w="3360" w:type="dxa"/>
@@ -5585,12 +5310,6 @@
         </w:tc>
       </w:tr>
       <w:tr>
-        <w:tblPrEx>
-          <w:tblCellMar>
-            <w:top w:w="0" w:type="dxa"/>
-            <w:bottom w:w="0" w:type="dxa"/>
-          </w:tblCellMar>
-        </w:tblPrEx>
         <w:tc>
           <w:tcPr>
             <w:tcW w:w="3360" w:type="dxa"/>
@@ -5880,10 +5599,7 @@
       </w:pPr>
       <w:bookmarkStart w:id="21" w:name="_Toc232953132"/>
       <w:r>
-        <w:t>5</w:t>
-      </w:r>
-      <w:r>
-        <w:t>. Conclusion</w:t>
+        <w:t>5. Conclusion</w:t>
       </w:r>
       <w:bookmarkEnd w:id="21"/>
     </w:p>

</xml_diff>